<commit_message>
docs(agency): cite original The Agency repository by msitarzewski
</commit_message>
<xml_diff>
--- a/PROMPT_MAESTRO_CREA_TU_AGENCIA_VIRTUAL_IA.docx
+++ b/PROMPT_MAESTRO_CREA_TU_AGENCIA_VIRTUAL_IA.docx
@@ -27,7 +27,20 @@
           <w:i/>
           <w:color w:val="475569"/>
         </w:rPr>
-        <w:t>**Propósito:** Plantilla lista para copiar y pegar en cualquier IA (**Antigravity**, **Cursor**, **Claude Code**, **ChatGPT**) para que construya un **Cuartel General Virtual en Pixel Art** con agentes autónomos, detector de cuellos de botella, radar web en vivo y conector Git adaptado a **tu propia empresa y problema**.</w:t>
+        <w:t>**Repositorio Base Original:** [The Agency (GitHub: msitarzewski/agency-agents)](https://github.com/msitarzewski/agency-agents) · [Sitio Oficial &amp; App](https://agencyagents.app)</w:t>
+      </w:r>
+    </w:p>
+    <w:p>
+      <w:pPr>
+        <w:spacing w:before="80" w:after="80"/>
+        <w:ind w:left="432"/>
+      </w:pPr>
+      <w:r>
+        <w:rPr>
+          <w:i/>
+          <w:color w:val="475569"/>
+        </w:rPr>
+        <w:t>**Propósito:** Plantilla lista para copiar y pegar en cualquier IA (**Antigravity**, **Cursor**, **Claude Code**, **ChatGPT**) para conectar el catálogo de más de 296 especialistas de **The Agency** en un **Cuartel General Virtual en Pixel Art** con detector de cuellos de botella, radar web en vivo y conector Git adaptado a **tu propia empresa y problema**.</w:t>
       </w:r>
     </w:p>
     <w:p>
@@ -41,6 +54,78 @@
           <w:color w:val="475569"/>
         </w:rPr>
         <w:t>**Formatos Disponibles:** PDF, Word (.docx) y Markdown en Google Drive.</w:t>
+      </w:r>
+    </w:p>
+    <w:p>
+      <w:pPr>
+        <w:spacing w:before="160" w:after="160"/>
+      </w:pPr>
+      <w:r>
+        <w:rPr>
+          <w:color w:val="CBD5E1"/>
+        </w:rPr>
+        <w:t>―――――――――――――――――――――――――――――――――――――――――――――――――――――――</w:t>
+      </w:r>
+    </w:p>
+    <w:p>
+      <w:pPr>
+        <w:pStyle w:val="Heading2"/>
+        <w:spacing w:before="320" w:after="120"/>
+      </w:pPr>
+      <w:r>
+        <w:rPr>
+          <w:rFonts w:ascii="Segoe UI" w:hAnsi="Segoe UI"/>
+          <w:b/>
+          <w:color w:val="0284C7"/>
+          <w:sz w:val="28"/>
+        </w:rPr>
+        <w:t>🎭 0. ¿DE DÓNDE SALE "THE AGENCY"?</w:t>
+      </w:r>
+    </w:p>
+    <w:p>
+      <w:pPr>
+        <w:spacing w:before="40" w:after="120"/>
+      </w:pPr>
+      <w:r>
+        <w:t xml:space="preserve">El catálogo de los 296 agentes no es un invento aislado: proviene del proyecto de código abierto </w:t>
+      </w:r>
+      <w:r>
+        <w:rPr>
+          <w:b/>
+        </w:rPr>
+        <w:t>[The Agency](https://github.com/msitarzewski/agency-agents)</w:t>
+      </w:r>
+      <w:r>
+        <w:t xml:space="preserve"> creado por </w:t>
+      </w:r>
+      <w:r>
+        <w:rPr>
+          <w:rFonts w:ascii="Consolas" w:hAnsi="Consolas"/>
+          <w:color w:val="0284C7"/>
+          <w:sz w:val="19"/>
+        </w:rPr>
+        <w:t>@msitarzewski</w:t>
+      </w:r>
+      <w:r>
+        <w:t>.</w:t>
+      </w:r>
+    </w:p>
+    <w:p>
+      <w:pPr>
+        <w:pStyle w:val="ListBullet"/>
+        <w:spacing w:before="20" w:after="40"/>
+      </w:pPr>
+      <w:r>
+        <w:t>Es una colección de más de 296 personalidades y roles especializados de IA probados en producción (ingeniería, diseño, marketing, ventas, seguridad, etc.).</w:t>
+      </w:r>
+    </w:p>
+    <w:p>
+      <w:pPr>
+        <w:pStyle w:val="ListBullet"/>
+        <w:spacing w:before="20" w:after="40"/>
+      </w:pPr>
+      <w:r>
+        <w:t>Nuestra capa añade el motor visual Pixel Art, la orquestación en pisos, la detección automática de cuellos de botella y la conexión con IAs de código.</w:t>
       </w:r>
     </w:p>
     <w:p>
@@ -842,7 +927,7 @@
         <w:t>Actúa como Arquitecto de Software Senior y Diseñador de Sistemas Agénticos.</w:t>
         <w:br/>
         <w:br/>
-        <w:t>Tu misión es construir desde cero un Cuartel General de Agencia Virtual Gamificado en Pixel Art (Canvas 2D HTML5 a 60 FPS) impulsado por un equipo de [NUMERO_DE_AGENTES] agentes de IA autónomos, diseñado específicamente para mi empresa:</w:t>
+        <w:t>Tu misión es tomar como base el catálogo de especialistas de "The Agency" (https://github.com/msitarzewski/agency-agents) y construir desde cero un Cuartel General de Agencia Virtual Gamificado en Pixel Art (Canvas 2D HTML5 a 60 FPS) impulsado por un equipo de [NUMERO_DE_AGENTES] agentes de IA autónomos, diseñado específicamente para mi empresa:</w:t>
         <w:br/>
         <w:br/>
         <w:t>================ DATOS DE MI EMPRESA ================</w:t>

</xml_diff>